<commit_message>
Doccument changes and final bug fixes
</commit_message>
<xml_diff>
--- a/Doccumentation/Design/Design doccumenation.docx
+++ b/Doccumentation/Design/Design doccumenation.docx
@@ -1823,7 +1823,7 @@
           <w:noProof/>
         </w:rPr>
         <w:drawing>
-          <wp:inline distT="0" distB="0" distL="0" distR="0" wp14:anchorId="4E6BEE4A" wp14:editId="71D0EAD8">
+          <wp:inline distT="0" distB="0" distL="0" distR="0" wp14:anchorId="4E6BEE4A" wp14:editId="11611300">
             <wp:extent cx="6327180" cy="8337550"/>
             <wp:effectExtent l="0" t="0" r="0" b="6350"/>
             <wp:docPr id="620558662" name="Picture 4"/>
@@ -3328,7 +3328,96 @@
         <w:t>Evaluation of solution</w:t>
       </w:r>
     </w:p>
-    <w:p/>
+    <w:p>
+      <w:r>
+        <w:t>Overall, we feel the solution we developed met the requirements set out to us by the client. We implemented three core features these being:</w:t>
+      </w:r>
+    </w:p>
+    <w:p>
+      <w:pPr>
+        <w:pStyle w:val="ListParagraph"/>
+        <w:numPr>
+          <w:ilvl w:val="0"/>
+          <w:numId w:val="2"/>
+        </w:numPr>
+      </w:pPr>
+      <w:r>
+        <w:t xml:space="preserve">The calendar system showing when doctors are available </w:t>
+      </w:r>
+    </w:p>
+    <w:p>
+      <w:pPr>
+        <w:pStyle w:val="ListParagraph"/>
+        <w:numPr>
+          <w:ilvl w:val="0"/>
+          <w:numId w:val="2"/>
+        </w:numPr>
+      </w:pPr>
+      <w:r>
+        <w:t xml:space="preserve">The appointment booking system • </w:t>
+      </w:r>
+    </w:p>
+    <w:p>
+      <w:pPr>
+        <w:pStyle w:val="ListParagraph"/>
+        <w:numPr>
+          <w:ilvl w:val="0"/>
+          <w:numId w:val="2"/>
+        </w:numPr>
+      </w:pPr>
+      <w:r>
+        <w:t xml:space="preserve">The patient record system </w:t>
+      </w:r>
+    </w:p>
+    <w:p>
+      <w:r>
+        <w:t xml:space="preserve">In addition, we implemented two vertical slice features </w:t>
+      </w:r>
+    </w:p>
+    <w:p>
+      <w:pPr>
+        <w:pStyle w:val="ListParagraph"/>
+        <w:numPr>
+          <w:ilvl w:val="0"/>
+          <w:numId w:val="3"/>
+        </w:numPr>
+      </w:pPr>
+      <w:r>
+        <w:t xml:space="preserve">A basic doctor form for doctors to see when their appointments are. </w:t>
+      </w:r>
+    </w:p>
+    <w:p>
+      <w:pPr>
+        <w:pStyle w:val="ListParagraph"/>
+        <w:numPr>
+          <w:ilvl w:val="0"/>
+          <w:numId w:val="3"/>
+        </w:numPr>
+      </w:pPr>
+      <w:r>
+        <w:t xml:space="preserve">A forgotten password system </w:t>
+      </w:r>
+    </w:p>
+    <w:p>
+      <w:r>
+        <w:t xml:space="preserve">It should be noted that the forgotten password system would have some kind of email verification but due to setting up and managing an email server being out of scope it is only a vertical slice. </w:t>
+      </w:r>
+    </w:p>
+    <w:p>
+      <w:r>
+        <w:t xml:space="preserve">Since the client also wanted the data on the database to be secure, we also implemented encryption, specifically on the SQLite file itself and the password attributes. </w:t>
+      </w:r>
+    </w:p>
+    <w:p>
+      <w:r>
+        <w:t xml:space="preserve">The solution could perhaps be improved by including a more robust back-end condition system, right now we have the categories of Illness, allergy and injury but more could be better than this test sample. </w:t>
+      </w:r>
+    </w:p>
+    <w:p>
+      <w:r>
+        <w:t>Overall, I feel our solution will be satisfactory to the client and what they were looking for. This system meeting all of the requirements set out for us in our opinion.</w:t>
+      </w:r>
+    </w:p>
     <w:sectPr>
       <w:pgSz w:w="11906" w:h="16838"/>
       <w:pgMar w:top="1440" w:right="1440" w:bottom="1440" w:left="1440" w:header="708" w:footer="708" w:gutter="0"/>
@@ -3539,8 +3628,240 @@
       </w:rPr>
     </w:lvl>
   </w:abstractNum>
+  <w:abstractNum w:abstractNumId="1" w15:restartNumberingAfterBreak="0">
+    <w:nsid w:val="29B94C2E"/>
+    <w:multiLevelType w:val="hybridMultilevel"/>
+    <w:tmpl w:val="69DA707E"/>
+    <w:lvl w:ilvl="0" w:tplc="08090001">
+      <w:start w:val="1"/>
+      <w:numFmt w:val="bullet"/>
+      <w:lvlText w:val=""/>
+      <w:lvlJc w:val="left"/>
+      <w:pPr>
+        <w:ind w:left="720" w:hanging="360"/>
+      </w:pPr>
+      <w:rPr>
+        <w:rFonts w:ascii="Symbol" w:hAnsi="Symbol" w:hint="default"/>
+      </w:rPr>
+    </w:lvl>
+    <w:lvl w:ilvl="1" w:tplc="08090003" w:tentative="1">
+      <w:start w:val="1"/>
+      <w:numFmt w:val="bullet"/>
+      <w:lvlText w:val="o"/>
+      <w:lvlJc w:val="left"/>
+      <w:pPr>
+        <w:ind w:left="1440" w:hanging="360"/>
+      </w:pPr>
+      <w:rPr>
+        <w:rFonts w:ascii="Courier New" w:hAnsi="Courier New" w:cs="Courier New" w:hint="default"/>
+      </w:rPr>
+    </w:lvl>
+    <w:lvl w:ilvl="2" w:tplc="08090005" w:tentative="1">
+      <w:start w:val="1"/>
+      <w:numFmt w:val="bullet"/>
+      <w:lvlText w:val=""/>
+      <w:lvlJc w:val="left"/>
+      <w:pPr>
+        <w:ind w:left="2160" w:hanging="360"/>
+      </w:pPr>
+      <w:rPr>
+        <w:rFonts w:ascii="Wingdings" w:hAnsi="Wingdings" w:hint="default"/>
+      </w:rPr>
+    </w:lvl>
+    <w:lvl w:ilvl="3" w:tplc="08090001" w:tentative="1">
+      <w:start w:val="1"/>
+      <w:numFmt w:val="bullet"/>
+      <w:lvlText w:val=""/>
+      <w:lvlJc w:val="left"/>
+      <w:pPr>
+        <w:ind w:left="2880" w:hanging="360"/>
+      </w:pPr>
+      <w:rPr>
+        <w:rFonts w:ascii="Symbol" w:hAnsi="Symbol" w:hint="default"/>
+      </w:rPr>
+    </w:lvl>
+    <w:lvl w:ilvl="4" w:tplc="08090003" w:tentative="1">
+      <w:start w:val="1"/>
+      <w:numFmt w:val="bullet"/>
+      <w:lvlText w:val="o"/>
+      <w:lvlJc w:val="left"/>
+      <w:pPr>
+        <w:ind w:left="3600" w:hanging="360"/>
+      </w:pPr>
+      <w:rPr>
+        <w:rFonts w:ascii="Courier New" w:hAnsi="Courier New" w:cs="Courier New" w:hint="default"/>
+      </w:rPr>
+    </w:lvl>
+    <w:lvl w:ilvl="5" w:tplc="08090005" w:tentative="1">
+      <w:start w:val="1"/>
+      <w:numFmt w:val="bullet"/>
+      <w:lvlText w:val=""/>
+      <w:lvlJc w:val="left"/>
+      <w:pPr>
+        <w:ind w:left="4320" w:hanging="360"/>
+      </w:pPr>
+      <w:rPr>
+        <w:rFonts w:ascii="Wingdings" w:hAnsi="Wingdings" w:hint="default"/>
+      </w:rPr>
+    </w:lvl>
+    <w:lvl w:ilvl="6" w:tplc="08090001" w:tentative="1">
+      <w:start w:val="1"/>
+      <w:numFmt w:val="bullet"/>
+      <w:lvlText w:val=""/>
+      <w:lvlJc w:val="left"/>
+      <w:pPr>
+        <w:ind w:left="5040" w:hanging="360"/>
+      </w:pPr>
+      <w:rPr>
+        <w:rFonts w:ascii="Symbol" w:hAnsi="Symbol" w:hint="default"/>
+      </w:rPr>
+    </w:lvl>
+    <w:lvl w:ilvl="7" w:tplc="08090003" w:tentative="1">
+      <w:start w:val="1"/>
+      <w:numFmt w:val="bullet"/>
+      <w:lvlText w:val="o"/>
+      <w:lvlJc w:val="left"/>
+      <w:pPr>
+        <w:ind w:left="5760" w:hanging="360"/>
+      </w:pPr>
+      <w:rPr>
+        <w:rFonts w:ascii="Courier New" w:hAnsi="Courier New" w:cs="Courier New" w:hint="default"/>
+      </w:rPr>
+    </w:lvl>
+    <w:lvl w:ilvl="8" w:tplc="08090005" w:tentative="1">
+      <w:start w:val="1"/>
+      <w:numFmt w:val="bullet"/>
+      <w:lvlText w:val=""/>
+      <w:lvlJc w:val="left"/>
+      <w:pPr>
+        <w:ind w:left="6480" w:hanging="360"/>
+      </w:pPr>
+      <w:rPr>
+        <w:rFonts w:ascii="Wingdings" w:hAnsi="Wingdings" w:hint="default"/>
+      </w:rPr>
+    </w:lvl>
+  </w:abstractNum>
+  <w:abstractNum w:abstractNumId="2" w15:restartNumberingAfterBreak="0">
+    <w:nsid w:val="35664AC1"/>
+    <w:multiLevelType w:val="hybridMultilevel"/>
+    <w:tmpl w:val="34A647C0"/>
+    <w:lvl w:ilvl="0" w:tplc="08090001">
+      <w:start w:val="1"/>
+      <w:numFmt w:val="bullet"/>
+      <w:lvlText w:val=""/>
+      <w:lvlJc w:val="left"/>
+      <w:pPr>
+        <w:ind w:left="720" w:hanging="360"/>
+      </w:pPr>
+      <w:rPr>
+        <w:rFonts w:ascii="Symbol" w:hAnsi="Symbol" w:hint="default"/>
+      </w:rPr>
+    </w:lvl>
+    <w:lvl w:ilvl="1" w:tplc="08090003" w:tentative="1">
+      <w:start w:val="1"/>
+      <w:numFmt w:val="bullet"/>
+      <w:lvlText w:val="o"/>
+      <w:lvlJc w:val="left"/>
+      <w:pPr>
+        <w:ind w:left="1440" w:hanging="360"/>
+      </w:pPr>
+      <w:rPr>
+        <w:rFonts w:ascii="Courier New" w:hAnsi="Courier New" w:cs="Courier New" w:hint="default"/>
+      </w:rPr>
+    </w:lvl>
+    <w:lvl w:ilvl="2" w:tplc="08090005" w:tentative="1">
+      <w:start w:val="1"/>
+      <w:numFmt w:val="bullet"/>
+      <w:lvlText w:val=""/>
+      <w:lvlJc w:val="left"/>
+      <w:pPr>
+        <w:ind w:left="2160" w:hanging="360"/>
+      </w:pPr>
+      <w:rPr>
+        <w:rFonts w:ascii="Wingdings" w:hAnsi="Wingdings" w:hint="default"/>
+      </w:rPr>
+    </w:lvl>
+    <w:lvl w:ilvl="3" w:tplc="08090001" w:tentative="1">
+      <w:start w:val="1"/>
+      <w:numFmt w:val="bullet"/>
+      <w:lvlText w:val=""/>
+      <w:lvlJc w:val="left"/>
+      <w:pPr>
+        <w:ind w:left="2880" w:hanging="360"/>
+      </w:pPr>
+      <w:rPr>
+        <w:rFonts w:ascii="Symbol" w:hAnsi="Symbol" w:hint="default"/>
+      </w:rPr>
+    </w:lvl>
+    <w:lvl w:ilvl="4" w:tplc="08090003" w:tentative="1">
+      <w:start w:val="1"/>
+      <w:numFmt w:val="bullet"/>
+      <w:lvlText w:val="o"/>
+      <w:lvlJc w:val="left"/>
+      <w:pPr>
+        <w:ind w:left="3600" w:hanging="360"/>
+      </w:pPr>
+      <w:rPr>
+        <w:rFonts w:ascii="Courier New" w:hAnsi="Courier New" w:cs="Courier New" w:hint="default"/>
+      </w:rPr>
+    </w:lvl>
+    <w:lvl w:ilvl="5" w:tplc="08090005" w:tentative="1">
+      <w:start w:val="1"/>
+      <w:numFmt w:val="bullet"/>
+      <w:lvlText w:val=""/>
+      <w:lvlJc w:val="left"/>
+      <w:pPr>
+        <w:ind w:left="4320" w:hanging="360"/>
+      </w:pPr>
+      <w:rPr>
+        <w:rFonts w:ascii="Wingdings" w:hAnsi="Wingdings" w:hint="default"/>
+      </w:rPr>
+    </w:lvl>
+    <w:lvl w:ilvl="6" w:tplc="08090001" w:tentative="1">
+      <w:start w:val="1"/>
+      <w:numFmt w:val="bullet"/>
+      <w:lvlText w:val=""/>
+      <w:lvlJc w:val="left"/>
+      <w:pPr>
+        <w:ind w:left="5040" w:hanging="360"/>
+      </w:pPr>
+      <w:rPr>
+        <w:rFonts w:ascii="Symbol" w:hAnsi="Symbol" w:hint="default"/>
+      </w:rPr>
+    </w:lvl>
+    <w:lvl w:ilvl="7" w:tplc="08090003" w:tentative="1">
+      <w:start w:val="1"/>
+      <w:numFmt w:val="bullet"/>
+      <w:lvlText w:val="o"/>
+      <w:lvlJc w:val="left"/>
+      <w:pPr>
+        <w:ind w:left="5760" w:hanging="360"/>
+      </w:pPr>
+      <w:rPr>
+        <w:rFonts w:ascii="Courier New" w:hAnsi="Courier New" w:cs="Courier New" w:hint="default"/>
+      </w:rPr>
+    </w:lvl>
+    <w:lvl w:ilvl="8" w:tplc="08090005" w:tentative="1">
+      <w:start w:val="1"/>
+      <w:numFmt w:val="bullet"/>
+      <w:lvlText w:val=""/>
+      <w:lvlJc w:val="left"/>
+      <w:pPr>
+        <w:ind w:left="6480" w:hanging="360"/>
+      </w:pPr>
+      <w:rPr>
+        <w:rFonts w:ascii="Wingdings" w:hAnsi="Wingdings" w:hint="default"/>
+      </w:rPr>
+    </w:lvl>
+  </w:abstractNum>
   <w:num w:numId="1" w16cid:durableId="1978879674">
     <w:abstractNumId w:val="0"/>
+  </w:num>
+  <w:num w:numId="2" w16cid:durableId="540168408">
+    <w:abstractNumId w:val="1"/>
+  </w:num>
+  <w:num w:numId="3" w16cid:durableId="1540971917">
+    <w:abstractNumId w:val="2"/>
   </w:num>
 </w:numbering>
 </file>
@@ -4158,7 +4479,6 @@
   <w:style w:type="character" w:default="1" w:styleId="DefaultParagraphFont">
     <w:name w:val="Default Paragraph Font"/>
     <w:uiPriority w:val="1"/>
-    <w:semiHidden/>
     <w:unhideWhenUsed/>
   </w:style>
   <w:style w:type="table" w:default="1" w:styleId="TableNormal">
@@ -4565,6 +4885,25 @@
       <w:ind w:left="440"/>
     </w:pPr>
   </w:style>
+  <w:style w:type="table" w:styleId="TableGrid">
+    <w:name w:val="Table Grid"/>
+    <w:basedOn w:val="TableNormal"/>
+    <w:uiPriority w:val="39"/>
+    <w:rsid w:val="00A44ED2"/>
+    <w:pPr>
+      <w:spacing w:after="0" w:line="240" w:lineRule="auto"/>
+    </w:pPr>
+    <w:tblPr>
+      <w:tblBorders>
+        <w:top w:val="single" w:sz="4" w:space="0" w:color="auto"/>
+        <w:left w:val="single" w:sz="4" w:space="0" w:color="auto"/>
+        <w:bottom w:val="single" w:sz="4" w:space="0" w:color="auto"/>
+        <w:right w:val="single" w:sz="4" w:space="0" w:color="auto"/>
+        <w:insideH w:val="single" w:sz="4" w:space="0" w:color="auto"/>
+        <w:insideV w:val="single" w:sz="4" w:space="0" w:color="auto"/>
+      </w:tblBorders>
+    </w:tblPr>
+  </w:style>
 </w:styles>
 </file>
 

</xml_diff>